<commit_message>
Mejora del ultimo parrafo del documento
</commit_message>
<xml_diff>
--- a/lab2/Informe Lab2 - Cabeza, Matienzo, Villafañe.docx
+++ b/lab2/Informe Lab2 - Cabeza, Matienzo, Villafañe.docx
@@ -272,6 +272,10 @@
     <w:sdt>
       <w:sdtPr>
         <w:rPr>
+          <w:rFonts w:ascii="Times New Roman" w:eastAsia="Arial" w:hAnsi="Times New Roman" w:cs="Times New Roman"/>
+          <w:color w:val="auto"/>
+          <w:sz w:val="22"/>
+          <w:szCs w:val="22"/>
           <w:lang w:val="es-ES"/>
         </w:rPr>
         <w:id w:val="-1514446848"/>
@@ -282,12 +286,8 @@
       </w:sdtPr>
       <w:sdtEndPr>
         <w:rPr>
-          <w:rFonts w:ascii="Times New Roman" w:eastAsia="Arial" w:hAnsi="Times New Roman" w:cs="Times New Roman"/>
           <w:b/>
           <w:bCs/>
-          <w:color w:val="auto"/>
-          <w:sz w:val="22"/>
-          <w:szCs w:val="22"/>
         </w:rPr>
       </w:sdtEndPr>
       <w:sdtContent>
@@ -983,7 +983,15 @@
         <w:jc w:val="both"/>
       </w:pPr>
       <w:r>
-        <w:t>Observamos que ambas señales (x7 y x8) tienen las mismas componentes armónicas de 40 y 60 hz con misma amplitud. Esto es porque ambas señales se generan a partir de la mismas suma de ondas senoidales diferenciándose solamente en el tiempo de muestreo.</w:t>
+        <w:t xml:space="preserve">Observamos que ambas señales (x7 y x8) tienen las mismas componentes armónicas de 40 y 60 </w:t>
+      </w:r>
+      <w:proofErr w:type="spellStart"/>
+      <w:r>
+        <w:t>hz</w:t>
+      </w:r>
+      <w:proofErr w:type="spellEnd"/>
+      <w:r>
+        <w:t xml:space="preserve"> con misma amplitud. Esto es porque ambas señales se generan a partir de la mismas suma de ondas senoidales diferenciándose solamente en el tiempo de muestreo.</w:t>
       </w:r>
     </w:p>
     <w:p>
@@ -1118,16 +1126,7 @@
         </w:rPr>
       </w:pPr>
       <w:r>
-        <w:t>A</w:t>
-      </w:r>
-      <w:r>
-        <w:t xml:space="preserve">nalizar la Serie de Fourier de Tiempo Discreto </w:t>
-      </w:r>
-      <w:r>
-        <w:t xml:space="preserve">obtenida </w:t>
-      </w:r>
-      <w:r>
-        <w:t xml:space="preserve">para la señal </w:t>
+        <w:t xml:space="preserve">Analizar la Serie de Fourier de Tiempo Discreto obtenida para la señal </w:t>
       </w:r>
       <w:r>
         <w:rPr>
@@ -1281,7 +1280,15 @@
         <w:jc w:val="both"/>
       </w:pPr>
       <w:r>
-        <w:t xml:space="preserve">A través de Python aplicamos el algoritmo FFT que es una implementación de la DFT (Transformada discreta de Fourier) ya que aplicado a un periodo u otro numero finito de muestras, se obtiene un resultado equivalente al análisis de la serie de Fourier de tiempo discreto. Podemos observar </w:t>
+        <w:t xml:space="preserve">A través de Python aplicamos el algoritmo FFT que es una implementación de la DFT (Transformada discreta de Fourier) ya que aplicado a un periodo u otro </w:t>
+      </w:r>
+      <w:proofErr w:type="spellStart"/>
+      <w:r>
+        <w:t>numero</w:t>
+      </w:r>
+      <w:proofErr w:type="spellEnd"/>
+      <w:r>
+        <w:t xml:space="preserve"> finito de muestras, se obtiene un resultado equivalente al análisis de la serie de Fourier de tiempo discreto. Podemos observar </w:t>
       </w:r>
       <w:r>
         <w:t>que,</w:t>
@@ -1415,6 +1422,9 @@
     </w:p>
     <w:p>
       <w:r>
+        <w:rPr>
+          <w:noProof/>
+        </w:rPr>
         <w:drawing>
           <wp:inline distT="0" distB="0" distL="0" distR="0" wp14:anchorId="7374B368" wp14:editId="5F1390EB">
             <wp:extent cx="2181529" cy="400106"/>
@@ -1470,13 +1480,7 @@
         <w:rPr>
           <w:rStyle w:val="markedcontent"/>
         </w:rPr>
-        <w:t xml:space="preserve">obtenida </w:t>
-      </w:r>
-      <w:r>
-        <w:rPr>
-          <w:rStyle w:val="markedcontent"/>
-        </w:rPr>
-        <w:t xml:space="preserve">para la señal </w:t>
+        <w:t xml:space="preserve">obtenida para la señal </w:t>
       </w:r>
       <w:r>
         <w:rPr>
@@ -1724,6 +1728,9 @@
         <w:jc w:val="center"/>
       </w:pPr>
       <w:r>
+        <w:rPr>
+          <w:noProof/>
+        </w:rPr>
         <w:drawing>
           <wp:inline distT="0" distB="0" distL="0" distR="0" wp14:anchorId="35F99B30" wp14:editId="43C34D04">
             <wp:extent cx="1190791" cy="466790"/>
@@ -1833,6 +1840,9 @@
         <w:jc w:val="center"/>
       </w:pPr>
       <w:r>
+        <w:rPr>
+          <w:noProof/>
+        </w:rPr>
         <w:drawing>
           <wp:inline distT="0" distB="0" distL="0" distR="0" wp14:anchorId="235DD9DF" wp14:editId="627C06E4">
             <wp:extent cx="1962424" cy="685896"/>
@@ -2322,12 +2332,8 @@
         <w:pStyle w:val="Ttulo3"/>
       </w:pPr>
       <w:bookmarkStart w:id="8" w:name="_Toc196735236"/>
-    </w:p>
-    <w:p>
-      <w:pPr>
-        <w:pStyle w:val="Ttulo3"/>
-      </w:pPr>
-      <w:r>
+      <w:r>
+        <w:lastRenderedPageBreak/>
         <w:t>Actividad 5</w:t>
       </w:r>
       <w:bookmarkEnd w:id="8"/>
@@ -2339,6 +2345,9 @@
     </w:p>
     <w:p>
       <w:r>
+        <w:rPr>
+          <w:noProof/>
+        </w:rPr>
         <w:drawing>
           <wp:inline distT="0" distB="0" distL="0" distR="0" wp14:anchorId="39775122" wp14:editId="31704C03">
             <wp:extent cx="5449060" cy="895475"/>
@@ -2392,11 +2401,19 @@
       <w:r>
         <w:br/>
       </w:r>
-      <w:r>
-        <w:rPr>
-          <w:rStyle w:val="markedcontent"/>
-        </w:rPr>
-        <w:t xml:space="preserve">ii)  Utilizando la función desarrolla encontrar la señal de salida del sistema cuando se aplica a la entrada la señal </w:t>
+      <w:proofErr w:type="spellStart"/>
+      <w:r>
+        <w:rPr>
+          <w:rStyle w:val="markedcontent"/>
+        </w:rPr>
+        <w:t>ii</w:t>
+      </w:r>
+      <w:proofErr w:type="spellEnd"/>
+      <w:r>
+        <w:rPr>
+          <w:rStyle w:val="markedcontent"/>
+        </w:rPr>
+        <w:t xml:space="preserve">)  Utilizando la función desarrolla encontrar la señal de salida del sistema cuando se aplica a la entrada la señal </w:t>
       </w:r>
       <w:r>
         <w:rPr>
@@ -2439,20 +2456,36 @@
       <w:r>
         <w:br/>
       </w:r>
-      <w:r>
-        <w:rPr>
-          <w:rStyle w:val="markedcontent"/>
-        </w:rPr>
-        <w:t xml:space="preserve">iii) Utilizando la función desarrollada en la Práctica de Laboratorio N°1 determinar si la señal de salida es periódica. </w:t>
+      <w:proofErr w:type="spellStart"/>
+      <w:r>
+        <w:rPr>
+          <w:rStyle w:val="markedcontent"/>
+        </w:rPr>
+        <w:t>iii</w:t>
+      </w:r>
+      <w:proofErr w:type="spellEnd"/>
+      <w:r>
+        <w:rPr>
+          <w:rStyle w:val="markedcontent"/>
+        </w:rPr>
+        <w:t xml:space="preserve">) Utilizando la función desarrollada en la Práctica de Laboratorio N°1 determinar si la señal de salida es periódica. </w:t>
       </w:r>
       <w:r>
         <w:br/>
       </w:r>
-      <w:r>
-        <w:rPr>
-          <w:rStyle w:val="markedcontent"/>
-        </w:rPr>
-        <w:t>iv) Utilizando la función desarrollada en la Práctica de Laboratorio N°1 determinar si la señal de salida es periódica si se considera los valores del intervalo −18≤</w:t>
+      <w:proofErr w:type="spellStart"/>
+      <w:r>
+        <w:rPr>
+          <w:rStyle w:val="markedcontent"/>
+        </w:rPr>
+        <w:t>iv</w:t>
+      </w:r>
+      <w:proofErr w:type="spellEnd"/>
+      <w:r>
+        <w:rPr>
+          <w:rStyle w:val="markedcontent"/>
+        </w:rPr>
+        <w:t>) Utilizando la función desarrollada en la Práctica de Laboratorio N°1 determinar si la señal de salida es periódica si se considera los valores del intervalo −18≤</w:t>
       </w:r>
       <w:r>
         <w:rPr>
@@ -2569,31 +2602,7 @@
           <w:rPr>
             <w:rFonts w:ascii="Cambria Math" w:hAnsi="Cambria Math"/>
           </w:rPr>
-          <m:t>18</m:t>
-        </m:r>
-        <m:r>
-          <w:rPr>
-            <w:rFonts w:ascii="Cambria Math" w:hAnsi="Cambria Math"/>
-          </w:rPr>
-          <m:t>≤</m:t>
-        </m:r>
-        <m:r>
-          <w:rPr>
-            <w:rFonts w:ascii="Cambria Math" w:hAnsi="Cambria Math"/>
-          </w:rPr>
-          <m:t xml:space="preserve"> n</m:t>
-        </m:r>
-        <m:r>
-          <w:rPr>
-            <w:rFonts w:ascii="Cambria Math" w:hAnsi="Cambria Math"/>
-          </w:rPr>
-          <m:t>≤</m:t>
-        </m:r>
-        <m:r>
-          <w:rPr>
-            <w:rFonts w:ascii="Cambria Math" w:hAnsi="Cambria Math"/>
-          </w:rPr>
-          <m:t xml:space="preserve"> 96</m:t>
+          <m:t>18≤ n≤ 96</m:t>
         </m:r>
       </m:oMath>
     </w:p>
@@ -2660,7 +2669,15 @@
     </w:p>
     <w:p>
       <w:r>
-        <w:t xml:space="preserve">En este caso se detecta periodicidad en la salida y1. Sabemos que la frecuencia de muestreo es de 1000Hz con lo cual el periodo de muestreo es 1ms. La función detecta una periodicidad de 50 muestras sin embargo en la gráfica se observa que entran 3 periodos de la señal en ese numero de muestras, con lo cual podemos intuir que el periodo real de la señal es 50/3 = 16.667 muestras. Si multiplicamos este número con el periodo de muestreo </w:t>
+        <w:t xml:space="preserve">En este caso se detecta periodicidad en la salida y1. Sabemos que la frecuencia de muestreo es de 1000Hz con lo cual el periodo de muestreo es 1ms. La función detecta una periodicidad de 50 muestras sin embargo en la gráfica se observa que entran 3 periodos de la señal en ese </w:t>
+      </w:r>
+      <w:proofErr w:type="spellStart"/>
+      <w:r>
+        <w:t>numero</w:t>
+      </w:r>
+      <w:proofErr w:type="spellEnd"/>
+      <w:r>
+        <w:t xml:space="preserve"> de muestras, con lo cual podemos intuir que el periodo real de la señal es 50/3 = 16.667 muestras. Si multiplicamos este número con el periodo de muestreo </w:t>
       </w:r>
       <w:r>
         <w:t>y calculamos la inversa de este resultado obtenemos la frecuencia de la señal en Hz.</w:t>
@@ -2708,7 +2725,15 @@
     <w:p/>
     <w:p>
       <w:r>
-        <w:t>La frecuencia de la señal de salida es igual al de una de las componentes de la señal de entrada. El sistema y1 esta actuando como filtro pasa alto cuya atenuación para la señal de 60Hz es prácticamente nula, ya que su amplitud se mantiene en 1.</w:t>
+        <w:t xml:space="preserve">La frecuencia de la señal de salida es igual al de una de las componentes de la señal de entrada. El sistema y1 </w:t>
+      </w:r>
+      <w:proofErr w:type="spellStart"/>
+      <w:r>
+        <w:t>esta</w:t>
+      </w:r>
+      <w:proofErr w:type="spellEnd"/>
+      <w:r>
+        <w:t xml:space="preserve"> actuando como filtro pasa alto cuya atenuación para la señal de 60Hz es prácticamente nula, ya que su amplitud se mantiene en 1.</w:t>
       </w:r>
     </w:p>
     <w:p/>
@@ -2747,13 +2772,7 @@
                 <w:rPr>
                   <w:rFonts w:ascii="Cambria Math" w:hAnsi="Cambria Math"/>
                 </w:rPr>
-                <m:t>25</m:t>
-              </m:r>
-              <m:r>
-                <w:rPr>
-                  <w:rFonts w:ascii="Cambria Math" w:hAnsi="Cambria Math"/>
-                </w:rPr>
-                <m:t>*1ms</m:t>
+                <m:t>25*1ms</m:t>
               </m:r>
             </m:den>
           </m:f>
@@ -2761,19 +2780,7 @@
             <w:rPr>
               <w:rFonts w:ascii="Cambria Math" w:hAnsi="Cambria Math"/>
             </w:rPr>
-            <m:t>=</m:t>
-          </m:r>
-          <m:r>
-            <w:rPr>
-              <w:rFonts w:ascii="Cambria Math" w:hAnsi="Cambria Math"/>
-            </w:rPr>
-            <m:t>40</m:t>
-          </m:r>
-          <m:r>
-            <w:rPr>
-              <w:rFonts w:ascii="Cambria Math" w:hAnsi="Cambria Math"/>
-            </w:rPr>
-            <m:t>Hz</m:t>
+            <m:t>=40Hz</m:t>
           </m:r>
         </m:oMath>
       </m:oMathPara>
@@ -2781,7 +2788,13 @@
     <w:p/>
     <w:p>
       <w:r>
-        <w:t>La frecuencia de salida es igual a la componente de baja frecuencia de la señal de entrada. Entonces el sistema y2 esta actuando como filtro pasa bajo cuya atenuación también es insignificante.</w:t>
+        <w:t xml:space="preserve">La frecuencia de salida es igual a la componente de baja frecuencia de la señal de entrada. Entonces el sistema y2 </w:t>
+      </w:r>
+      <w:r>
+        <w:t>está</w:t>
+      </w:r>
+      <w:r>
+        <w:t xml:space="preserve"> actuando como filtro pasa bajo cuya atenuación también es insignificante.</w:t>
       </w:r>
     </w:p>
     <w:p/>
@@ -2935,7 +2948,7 @@
         </w:rPr>
       </w:pPr>
       <w:r>
-        <w:t>Se observan similitudes en la señal, pero en el primer caso donde se obtienen las salidas de cada componente por separado y luego se las suma, la señal se atenúa casi completamente con el tiempo. Teóricamente esto no debería ocurrir y quizás haya un problema con la precisión de los cálculos en punto flotante y el hecho de que dígitos de muy pequeña magnitud se podrían estar perdiendo con lo cual se pierde su contribución para la amplitud de la señal.</w:t>
+        <w:t>Se observan similitudes en la señal en ambos casos. Sin embargo, en el primer enfoque, donde se obtienen las salidas de cada componente por separado y luego se suman, la señal resultante se atenúa casi por completo con el tiempo. Teóricamente, esto no debería ocurrir, lo que sugiere que podría estar ocurriendo una pérdida de precisión debido al uso de aritmética en punto flotante. Es posible que los valores de muy baja magnitud estén siendo descartados o redondeados, lo cual afecta significativamente la amplitud final de la señal al perderse su contribución.</w:t>
       </w:r>
     </w:p>
     <w:sectPr>

</xml_diff>